<commit_message>
Add repository and video links to report title page
Co-Authored-By: Claude Sonnet 5.5 <noreply@anthropic.com>
</commit_message>
<xml_diff>
--- a/report/MLOps_Assignment1_Report.docx
+++ b/report/MLOps_Assignment1_Report.docx
@@ -51,6 +51,31 @@
     </w:p>
     <w:p>
       <w:pPr>
+        <w:spacing w:after="20"/>
+        <w:jc w:val="center"/>
+      </w:pPr>
+      <w:r>
+        <w:rPr>
+          <w:rFonts w:ascii="Calibri" w:cs="Calibri" w:eastAsia="Calibri" w:hAnsi="Calibri"/>
+          <w:b/>
+          <w:bCs/>
+          <w:sz w:val="19"/>
+          <w:szCs w:val="19"/>
+        </w:rPr>
+        <w:t xml:space="preserve">Repository: </w:t>
+      </w:r>
+      <w:r>
+        <w:rPr>
+          <w:rFonts w:ascii="Calibri" w:cs="Calibri" w:eastAsia="Calibri" w:hAnsi="Calibri"/>
+          <w:color w:val="1F4E79"/>
+          <w:sz w:val="19"/>
+          <w:szCs w:val="19"/>
+        </w:rPr>
+        <w:t xml:space="preserve">https://github.com/Nimi060900/heart-disease-mlops</w:t>
+      </w:r>
+    </w:p>
+    <w:p>
+      <w:pPr>
         <w:pBdr>
           <w:bottom w:val="single" w:color="2A9D8F" w:sz="6" w:space="4"/>
         </w:pBdr>
@@ -60,11 +85,21 @@
       <w:r>
         <w:rPr>
           <w:rFonts w:ascii="Calibri" w:cs="Calibri" w:eastAsia="Calibri" w:hAnsi="Calibri"/>
-          <w:color w:val="1F4E79"/>
+          <w:b/>
+          <w:bCs/>
           <w:sz w:val="19"/>
           <w:szCs w:val="19"/>
         </w:rPr>
-        <w:t xml:space="preserve">Repository: https://github.com/Nimi060900/heart-disease-mlops</w:t>
+        <w:t xml:space="preserve">Demo video: </w:t>
+      </w:r>
+      <w:r>
+        <w:rPr>
+          <w:rFonts w:ascii="Calibri" w:cs="Calibri" w:eastAsia="Calibri" w:hAnsi="Calibri"/>
+          <w:color w:val="1F4E79"/>
+          <w:sz w:val="17"/>
+          <w:szCs w:val="17"/>
+        </w:rPr>
+        <w:t xml:space="preserve">https://drive.google.com/file/d/1tRNAtp2mYR-rczdqP4WBwBspnhAxGpmy/view?usp=drive_link</w:t>
       </w:r>
     </w:p>
     <w:p>

</xml_diff>